<commit_message>
feat: upload updated project documents and live library database
</commit_message>
<xml_diff>
--- a/unit-2-agile-planning/Unit-2-Agile-Mini-Project.docx
+++ b/unit-2-agile-planning/Unit-2-Agile-Mini-Project.docx
@@ -38,7 +38,14 @@
           <w:b/>
           <w:lang w:val="nl-BE"/>
         </w:rPr>
-        <w:t>Name: Om Tambe</w:t>
+        <w:t xml:space="preserve">Name: </w:t>
+      </w:r>
+      <w:r>
+        <w:rPr>
+          <w:b/>
+          <w:lang w:val="nl-BE"/>
+        </w:rPr>
+        <w:t>Shivraj Dhumal</w:t>
       </w:r>
     </w:p>
     <w:p>
@@ -53,7 +60,14 @@
           <w:b/>
           <w:lang w:val="nl-BE"/>
         </w:rPr>
-        <w:t>PRN: 2125UMLM1065</w:t>
+        <w:t>PRN: 2125UMLM10</w:t>
+      </w:r>
+      <w:r>
+        <w:rPr>
+          <w:b/>
+          <w:lang w:val="nl-BE"/>
+        </w:rPr>
+        <w:t>08</w:t>
       </w:r>
     </w:p>
     <w:p>

</xml_diff>